<commit_message>
fix About styling, and updated docx
</commit_message>
<xml_diff>
--- a/public/StrangeRipples.docx
+++ b/public/StrangeRipples.docx
@@ -100,6 +100,7 @@
       <w:r>
         <w:rPr>
           <w:b w:val="1"/>
+          <w:bCs w:val="1"/>
           <w:highlight w:val="white"/>
           <w:rtl w:val="0"/>
         </w:rPr>
@@ -323,6 +324,7 @@
       <w:r>
         <w:rPr>
           <w:i w:val="1"/>
+          <w:iCs w:val="1"/>
           <w:highlight w:val="white"/>
           <w:rtl w:val="0"/>
         </w:rPr>
@@ -345,6 +347,7 @@
       <w:r>
         <w:rPr>
           <w:i w:val="1"/>
+          <w:iCs w:val="1"/>
           <w:highlight w:val="white"/>
           <w:rtl w:val="0"/>
         </w:rPr>
@@ -360,6 +363,7 @@
       <w:r>
         <w:rPr>
           <w:i w:val="1"/>
+          <w:iCs w:val="1"/>
           <w:highlight w:val="white"/>
           <w:rtl w:val="0"/>
         </w:rPr>
@@ -382,6 +386,7 @@
       <w:r>
         <w:rPr>
           <w:i w:val="1"/>
+          <w:iCs w:val="1"/>
           <w:highlight w:val="white"/>
           <w:rtl w:val="0"/>
         </w:rPr>
@@ -444,7 +449,7 @@
           <w:highlight w:val="white"/>
           <w:rtl w:val="0"/>
         </w:rPr>
-        <w:t xml:space="preserve">I look around, feel my bedsheets underneath me, and see the sun peeking through the window.  It is May of 2015 and I am 31 years old. I am completely oblivious to the turn that my life and view of reality will take in about a month’s time, a multi-year journey set into motion by an encounter with a potent, mind-altering plant. </w:t>
+        <w:t xml:space="preserve">I look around, feel my bedsheets underneath me, and see the sun peeking through the window. It is May of 2015 and I am 31 years old. I am completely oblivious to the turn that my life and view of reality will take in about a month’s time, a multi-year journey set into motion by an encounter with a potent, mind-altering plant. </w:t>
       </w:r>
     </w:p>
     <w:p>
@@ -477,6 +482,7 @@
       <w:r>
         <w:rPr>
           <w:i w:val="1"/>
+          <w:iCs w:val="1"/>
           <w:highlight w:val="white"/>
           <w:rtl w:val="0"/>
         </w:rPr>
@@ -487,11 +493,35 @@
           <w:highlight w:val="white"/>
           <w:rtl w:val="0"/>
         </w:rPr>
-        <w:t xml:space="preserve">, Michael Pollan (of “How to Change Your Mind” fame) examines humanity’s intricate relationship with plants. In a small passage in the introduction of the book, he describes the gardens that humans have maintained throughout history–gardens that are tended purposefully to include plants that can heal, plants that can kill, and a few “...with the astounding power to alter consciousness–even to </w:t>
-      </w:r>
-      <w:r>
-        <w:rPr>
-          <w:i w:val="1"/>
+        <w:t xml:space="preserve">, Michael Pollan (of </w:t>
+      </w:r>
+      <w:r>
+        <w:rPr>
+          <w:i w:val="1"/>
+          <w:iCs w:val="1"/>
+          <w:highlight w:val="white"/>
+          <w:rtl w:val="0"/>
+        </w:rPr>
+        <w:t xml:space="preserve">How to Change Your Mind</w:t>
+      </w:r>
+      <w:r>
+        <w:rPr>
+          <w:highlight w:val="white"/>
+          <w:rtl w:val="0"/>
+        </w:rPr>
+        <w:t xml:space="preserve"> </w:t>
+      </w:r>
+      <w:r>
+        <w:rPr>
+          <w:highlight w:val="white"/>
+          <w:rtl w:val="0"/>
+        </w:rPr>
+        <w:t xml:space="preserve">fame) examines humanity’s intimate relationship with plants. In a small passage in the introduction of the book, he describes the gardens that humans have maintained throughout history–gardens that are tended purposefully to include plants that can heal, plants that can kill, and a few “...with the astounding power to alter consciousness–even to </w:t>
+      </w:r>
+      <w:r>
+        <w:rPr>
+          <w:i w:val="1"/>
+          <w:iCs w:val="1"/>
           <w:highlight w:val="white"/>
           <w:rtl w:val="0"/>
         </w:rPr>
@@ -559,6 +589,7 @@
       <w:r>
         <w:rPr>
           <w:i w:val="1"/>
+          <w:iCs w:val="1"/>
           <w:highlight w:val="white"/>
           <w:rtl w:val="0"/>
         </w:rPr>
@@ -607,6 +638,7 @@
       <w:r>
         <w:rPr>
           <w:i w:val="1"/>
+          <w:iCs w:val="1"/>
           <w:highlight w:val="white"/>
           <w:rtl w:val="0"/>
         </w:rPr>
@@ -622,6 +654,7 @@
       <w:r>
         <w:rPr>
           <w:i w:val="1"/>
+          <w:iCs w:val="1"/>
           <w:highlight w:val="white"/>
           <w:rtl w:val="0"/>
         </w:rPr>
@@ -637,6 +670,7 @@
       <w:r>
         <w:rPr>
           <w:i w:val="1"/>
+          <w:iCs w:val="1"/>
           <w:highlight w:val="white"/>
           <w:rtl w:val="0"/>
         </w:rPr>
@@ -652,6 +686,7 @@
       <w:r>
         <w:rPr>
           <w:i w:val="1"/>
+          <w:iCs w:val="1"/>
           <w:highlight w:val="white"/>
           <w:rtl w:val="0"/>
         </w:rPr>
@@ -721,6 +756,7 @@
       <w:r>
         <w:rPr>
           <w:i w:val="1"/>
+          <w:iCs w:val="1"/>
           <w:highlight w:val="white"/>
           <w:rtl w:val="0"/>
         </w:rPr>
@@ -809,11 +845,12 @@
           <w:highlight w:val="white"/>
           <w:rtl w:val="0"/>
         </w:rPr>
-        <w:t xml:space="preserve">Eight years into my journey with these plants and fungi, one thing that has struck me as the most odd about these experiences is a side effect, or a more appropriately titled </w:t>
-      </w:r>
-      <w:r>
-        <w:rPr>
-          <w:i w:val="1"/>
+        <w:t xml:space="preserve">Eight years into my journey with these plants and fungi, one thing that has struck me as the most odd about these experiences is a side effect, or more appropriately titled </w:t>
+      </w:r>
+      <w:r>
+        <w:rPr>
+          <w:i w:val="1"/>
+          <w:iCs w:val="1"/>
           <w:highlight w:val="white"/>
           <w:rtl w:val="0"/>
         </w:rPr>
@@ -890,6 +927,7 @@
       <w:r>
         <w:rPr>
           <w:i w:val="1"/>
+          <w:iCs w:val="1"/>
           <w:highlight w:val="white"/>
           <w:rtl w:val="0"/>
         </w:rPr>
@@ -905,6 +943,7 @@
       <w:r>
         <w:rPr>
           <w:i w:val="1"/>
+          <w:iCs w:val="1"/>
           <w:highlight w:val="white"/>
           <w:rtl w:val="0"/>
         </w:rPr>
@@ -915,22 +954,7 @@
           <w:highlight w:val="white"/>
           <w:rtl w:val="0"/>
         </w:rPr>
-        <w:t xml:space="preserve">There is a clarity, intensity, and lucidity to them, certain themes and images repeat themselves. You could even say that they are experienced with part of your awake mind. These dreams are </w:t>
-      </w:r>
-      <w:r>
-        <w:rPr>
-          <w:i w:val="1"/>
-          <w:highlight w:val="white"/>
-          <w:rtl w:val="0"/>
-        </w:rPr>
-        <w:t xml:space="preserve">remembered</w:t>
-      </w:r>
-      <w:r>
-        <w:rPr>
-          <w:highlight w:val="white"/>
-          <w:rtl w:val="0"/>
-        </w:rPr>
-        <w:t xml:space="preserve"> vividly. </w:t>
+        <w:t xml:space="preserve">There is a clarity, intensity, and lucidity to them. Certain themes and images repeat themselves. They have been described as deep dreaming with an awake mind. These dreams are remembered vividly. </w:t>
       </w:r>
       <w:r>
         <w:rPr>
@@ -1022,12 +1046,14 @@
       <w:pPr>
         <w:rPr>
           <w:i w:val="1"/>
-          <w:highlight w:val="white"/>
-        </w:rPr>
-      </w:pPr>
-      <w:r>
-        <w:rPr>
-          <w:i w:val="1"/>
+          <w:iCs w:val="1"/>
+          <w:highlight w:val="white"/>
+        </w:rPr>
+      </w:pPr>
+      <w:r>
+        <w:rPr>
+          <w:i w:val="1"/>
+          <w:iCs w:val="1"/>
           <w:highlight w:val="white"/>
           <w:rtl w:val="0"/>
         </w:rPr>
@@ -1097,7 +1123,7 @@
           <w:highlight w:val="white"/>
           <w:rtl w:val="0"/>
         </w:rPr>
-        <w:t xml:space="preserve">One month before I drank the pungent sweet brew for the first time on June 19th 2015, I had no idea I would be imbibing it. I was not actively seeking it. Although I had heard of it and some of its immediate effects, I had little idea of what it actually entailed. I won’t kid you, some of those things sounded pretty strange. Yet, it was in this period that I had the most bizarre dream of my life up until that point. As I would come to realize, this dream with a disk in the sky eerily mirrored many facets and shared many characteristics of the Ayahuasca experience itself.</w:t>
+        <w:t xml:space="preserve">One month before I drank the pungent sweet brew for the first time on June 19th, 2015, I had no idea I would be imbibing it. I was not actively seeking it. Although I had heard of it and some of its immediate effects, I had little idea of what it actually entailed. I won’t kid you, some of those things sounded pretty strange. Yet, it was in this period that I had the most bizarre dream of my life up until that point. As I would come to realize, this dream with a disk in the sky eerily mirrored many facets and shared many characteristics I would experience in the later Ayahuasca journeys themselves.</w:t>
       </w:r>
     </w:p>
     <w:p>
@@ -1274,6 +1300,7 @@
       <w:r>
         <w:rPr>
           <w:i w:val="1"/>
+          <w:iCs w:val="1"/>
           <w:highlight w:val="white"/>
           <w:rtl w:val="0"/>
         </w:rPr>
@@ -1322,6 +1349,7 @@
       <w:r>
         <w:rPr>
           <w:i w:val="1"/>
+          <w:iCs w:val="1"/>
           <w:highlight w:val="white"/>
           <w:rtl w:val="0"/>
         </w:rPr>
@@ -1337,6 +1365,7 @@
       <w:r>
         <w:rPr>
           <w:i w:val="1"/>
+          <w:iCs w:val="1"/>
           <w:highlight w:val="white"/>
           <w:rtl w:val="0"/>
         </w:rPr>
@@ -1366,6 +1395,7 @@
       <w:r>
         <w:rPr>
           <w:i w:val="1"/>
+          <w:iCs w:val="1"/>
           <w:highlight w:val="white"/>
           <w:rtl w:val="0"/>
         </w:rPr>
@@ -1495,6 +1525,7 @@
       <w:r>
         <w:rPr>
           <w:i w:val="1"/>
+          <w:iCs w:val="1"/>
           <w:highlight w:val="white"/>
           <w:rtl w:val="0"/>
         </w:rPr>
@@ -1733,6 +1764,7 @@
       <w:r>
         <w:rPr>
           <w:i w:val="1"/>
+          <w:iCs w:val="1"/>
           <w:highlight w:val="white"/>
           <w:rtl w:val="0"/>
         </w:rPr>
@@ -1830,6 +1862,7 @@
       <w:r>
         <w:rPr>
           <w:b w:val="1"/>
+          <w:bCs w:val="1"/>
           <w:highlight w:val="white"/>
           <w:rtl w:val="0"/>
         </w:rPr>
@@ -1871,6 +1904,7 @@
       <w:r>
         <w:rPr>
           <w:i w:val="1"/>
+          <w:iCs w:val="1"/>
           <w:highlight w:val="white"/>
           <w:rtl w:val="0"/>
         </w:rPr>
@@ -1974,6 +2008,7 @@
       <w:r>
         <w:rPr>
           <w:i w:val="1"/>
+          <w:iCs w:val="1"/>
           <w:highlight w:val="white"/>
           <w:rtl w:val="0"/>
         </w:rPr>
@@ -2014,6 +2049,7 @@
       <w:r>
         <w:rPr>
           <w:i w:val="1"/>
+          <w:iCs w:val="1"/>
           <w:highlight w:val="white"/>
           <w:rtl w:val="0"/>
         </w:rPr>
@@ -2113,6 +2149,7 @@
       <w:pPr>
         <w:rPr>
           <w:i w:val="1"/>
+          <w:iCs w:val="1"/>
           <w:highlight w:val="white"/>
         </w:rPr>
       </w:pPr>
@@ -2216,6 +2253,7 @@
       <w:r>
         <w:rPr>
           <w:i w:val="1"/>
+          <w:iCs w:val="1"/>
           <w:highlight w:val="white"/>
           <w:rtl w:val="0"/>
         </w:rPr>
@@ -2231,6 +2269,7 @@
       <w:r>
         <w:rPr>
           <w:i w:val="1"/>
+          <w:iCs w:val="1"/>
           <w:highlight w:val="white"/>
           <w:rtl w:val="0"/>
         </w:rPr>
@@ -2260,6 +2299,7 @@
       <w:r>
         <w:rPr>
           <w:i w:val="1"/>
+          <w:iCs w:val="1"/>
           <w:highlight w:val="white"/>
           <w:rtl w:val="0"/>
         </w:rPr>
@@ -2275,6 +2315,7 @@
       <w:r>
         <w:rPr>
           <w:i w:val="1"/>
+          <w:iCs w:val="1"/>
           <w:highlight w:val="white"/>
           <w:rtl w:val="0"/>
         </w:rPr>
@@ -2339,7 +2380,7 @@
           <w:highlight w:val="white"/>
           <w:rtl w:val="0"/>
         </w:rPr>
-        <w:t xml:space="preserve">. The importance of the stories like this that are shared by his guests is paramount. </w:t>
+        <w:t xml:space="preserve">. The importance of sharing stories like these is paramount. </w:t>
       </w:r>
     </w:p>
     <w:p>
@@ -2595,6 +2636,7 @@
       <w:r>
         <w:rPr>
           <w:b w:val="1"/>
+          <w:bCs w:val="1"/>
           <w:highlight w:val="white"/>
           <w:rtl w:val="0"/>
         </w:rPr>
@@ -3025,6 +3067,7 @@
       <w:r>
         <w:rPr>
           <w:i w:val="1"/>
+          <w:iCs w:val="1"/>
           <w:highlight w:val="white"/>
           <w:rtl w:val="0"/>
         </w:rPr>
@@ -3066,6 +3109,7 @@
       <w:r>
         <w:rPr>
           <w:i w:val="1"/>
+          <w:iCs w:val="1"/>
           <w:highlight w:val="white"/>
           <w:rtl w:val="0"/>
         </w:rPr>
@@ -3107,6 +3151,7 @@
       <w:r>
         <w:rPr>
           <w:i w:val="1"/>
+          <w:iCs w:val="1"/>
           <w:highlight w:val="white"/>
           <w:rtl w:val="0"/>
         </w:rPr>
@@ -3162,12 +3207,14 @@
       <w:pPr>
         <w:rPr>
           <w:i w:val="1"/>
-          <w:highlight w:val="white"/>
-        </w:rPr>
-      </w:pPr>
-      <w:r>
-        <w:rPr>
-          <w:i w:val="1"/>
+          <w:iCs w:val="1"/>
+          <w:highlight w:val="white"/>
+        </w:rPr>
+      </w:pPr>
+      <w:r>
+        <w:rPr>
+          <w:i w:val="1"/>
+          <w:iCs w:val="1"/>
           <w:highlight w:val="white"/>
           <w:rtl w:val="0"/>
         </w:rPr>
@@ -3302,6 +3349,7 @@
       <w:r>
         <w:rPr>
           <w:i w:val="1"/>
+          <w:iCs w:val="1"/>
           <w:rtl w:val="0"/>
         </w:rPr>
         <w:t xml:space="preserve">Amazonian Cosmos</w:t>
@@ -3336,6 +3384,7 @@
       <w:r>
         <w:rPr>
           <w:i w:val="1"/>
+          <w:iCs w:val="1"/>
           <w:rtl w:val="0"/>
         </w:rPr>
         <w:t xml:space="preserve">Plants of the Gods</w:t>
@@ -3370,6 +3419,7 @@
       <w:r>
         <w:rPr>
           <w:i w:val="1"/>
+          <w:iCs w:val="1"/>
           <w:rtl w:val="0"/>
         </w:rPr>
         <w:t xml:space="preserve">The Way of the Shaman</w:t>
@@ -3530,6 +3580,7 @@
       <w:r>
         <w:rPr>
           <w:i w:val="1"/>
+          <w:iCs w:val="1"/>
           <w:rtl w:val="0"/>
         </w:rPr>
         <w:t xml:space="preserve">The Lost Children</w:t>
@@ -3708,6 +3759,7 @@
       <w:r>
         <w:rPr>
           <w:b w:val="1"/>
+          <w:bCs w:val="1"/>
           <w:rtl w:val="0"/>
         </w:rPr>
         <w:t xml:space="preserve">yagé</w:t>
@@ -3812,6 +3864,7 @@
         <w:r>
           <w:rPr>
             <w:b w:val="1"/>
+            <w:bCs w:val="1"/>
             <w:color w:val="1155cc"/>
             <w:u w:val="single"/>
             <w:rtl w:val="0"/>
@@ -3829,6 +3882,7 @@
         <w:r>
           <w:rPr>
             <w:b w:val="1"/>
+            <w:bCs w:val="1"/>
             <w:color w:val="1155cc"/>
             <w:u w:val="single"/>
             <w:rtl w:val="0"/>
@@ -3957,7 +4011,7 @@
           <w:highlight w:val="white"/>
           <w:rtl w:val="0"/>
         </w:rPr>
-        <w:t xml:space="preserve">This piece was originally published on June 9th, 2024, the one year anniversary of the rescue. That is a total coincidence. The documentary was released on November 14th 2024. After I saw the Netflix documentary, I knew I had to update this piece to reflect the story and the similarities between it, and what I had been experiencing for the better part of the last decade. This particular article is just a start of the process of me telling this story. </w:t>
+        <w:t xml:space="preserve">This piece was originally published on June 9th, 2024, the one year anniversary of the rescue. That would be a total coincidence. The documentary was released on November 14th 2024. After I saw the Netflix documentary, I knew I had to update this piece to reflect the story and the similarities between it, and what I had been experiencing for the better part of the last decade. This particular article is just a start of the process of me telling this story. </w:t>
       </w:r>
     </w:p>
     <w:p>
@@ -3972,8 +4026,7 @@
           <w:highlight w:val="white"/>
           <w:rtl w:val="0"/>
         </w:rPr>
-        <w:t xml:space="preserve">In the cases of Paul Stamets and Kyle Buller, the revelations they received were not something they actively sought—they arrived uninvited, yet carried meaning that was undeniably tethered to real-world events. With visionary plants and fungi, nothing is by accident. Every transmission feels precise, intentional, and purposeful. In the story of the Lost Children of the Amazon, the message was just as clear: an indigenous shaman, having communed with the spirit of the plants, pointed the search party in a direction and said, “Go that way.” The ability of these plants to guide or reveal hidden truths is not a fringe belief—it’s woven into the mythology and cosmology of the cultures that have worked with them for generations. Similar ideas are woven into Ancient Greek culture. Oracles and things. Another article entirely.</w:t>
-        <w:tab/>
+        <w:t xml:space="preserve">In the cases of Paul Stamets and Kyle Buller, the revelations they received were not something they actively sought—they arrived uninvited, yet carried meaning that was undeniably tethered to real-world events. With visionary plants and fungi, nothing is by accident. Every transmission feels precise, intentional, and purposeful. In the story of the Lost Children of the Amazon, the message was just as clear: an indigenous shaman, having communed with the spirit of the plants, pointed the search party in a direction and said, “Go that way.” The ability of these plants to guide or reveal hidden truths is not a fringe belief—it’s woven into the mythology and cosmology of the cultures that have worked with them for generations. Similar ideas are woven into Ancient Greek culture. Oracles and potions and things; another article entirely.</w:t>
       </w:r>
     </w:p>
     <w:p>
@@ -3993,6 +4046,7 @@
       <w:r>
         <w:rPr>
           <w:i w:val="1"/>
+          <w:iCs w:val="1"/>
           <w:highlight w:val="white"/>
           <w:rtl w:val="0"/>
         </w:rPr>
@@ -4022,11 +4076,12 @@
           <w:highlight w:val="white"/>
           <w:rtl w:val="0"/>
         </w:rPr>
-        <w:t xml:space="preserve">That particular dream’s animate and sensory nature was identical to the Ayahuasca experience in the immediacy of ingestion. I have even experienced little hallmarks of my first, pre-Aya dream experience later on in Ayahuasca and Mushroom journeys, a reference to a real location, physical/emotional sensations, </w:t>
-      </w:r>
-      <w:r>
-        <w:rPr>
-          <w:i w:val="1"/>
+        <w:t xml:space="preserve">That first dream’s animate and sensory nature was identical to the Ayahuasca experience in the immediacy of ingestion, but before ingestion. I have even experienced little hallmarks of my first, pre-Aya dream experience later on in Ayahuasca and Mushroom journeys, a reference to a real location, physical/emotional sensations, </w:t>
+      </w:r>
+      <w:r>
+        <w:rPr>
+          <w:i w:val="1"/>
+          <w:iCs w:val="1"/>
           <w:highlight w:val="white"/>
           <w:rtl w:val="0"/>
         </w:rPr>
@@ -4037,7 +4092,47 @@
           <w:highlight w:val="white"/>
           <w:rtl w:val="0"/>
         </w:rPr>
-        <w:t xml:space="preserve">. It is as if the same artist were using the same brushes to create it. The dream was the preview and later, the Ayahuasca “journey” itself was the continuation. There was another ‘presence’ in the dream, which seemed to have control over what I was experiencing. This is a central attribute of what Ayahuasca does. This is what the </w:t>
+        <w:t xml:space="preserve">. It is as if the same artist were using the same brushes to create it. </w:t>
+      </w:r>
+    </w:p>
+    <w:p>
+      <w:pPr>
+        <w:rPr>
+          <w:highlight w:val="white"/>
+        </w:rPr>
+      </w:pPr>
+      <w:r>
+        <w:rPr>
+          <w:highlight w:val="white"/>
+          <w:rtl w:val="0"/>
+        </w:rPr>
+        <w:t xml:space="preserve">Using the content and the context of both things from my own mind, and not. </w:t>
+      </w:r>
+    </w:p>
+    <w:p>
+      <w:pPr>
+        <w:rPr>
+          <w:highlight w:val="white"/>
+        </w:rPr>
+      </w:pPr>
+      <w:r>
+        <w:rPr>
+          <w:rtl w:val="0"/>
+        </w:rPr>
+      </w:r>
+    </w:p>
+    <w:p>
+      <w:pPr>
+        <w:rPr>
+          <w:highlight w:val="white"/>
+        </w:rPr>
+      </w:pPr>
+      <w:r>
+        <w:rPr>
+          <w:highlight w:val="white"/>
+          <w:rtl w:val="0"/>
+        </w:rPr>
+        <w:t xml:space="preserve">The dream was the preview and later, the Ayahuasca “journey” itself was the continuation. There was another ‘presence’ in the dream, which seemed to have control over what I was experiencing. This is a central attribute of what Ayahuasca does. This is what the </w:t>
       </w:r>
       <w:r>
         <w:rPr>
@@ -4049,6 +4144,7 @@
       <w:r>
         <w:rPr>
           <w:i w:val="1"/>
+          <w:iCs w:val="1"/>
           <w:highlight w:val="white"/>
           <w:rtl w:val="0"/>
         </w:rPr>
@@ -4064,6 +4160,7 @@
       <w:r>
         <w:rPr>
           <w:i w:val="1"/>
+          <w:iCs w:val="1"/>
           <w:highlight w:val="white"/>
           <w:rtl w:val="0"/>
         </w:rPr>
@@ -4086,6 +4183,7 @@
       <w:r>
         <w:rPr>
           <w:i w:val="1"/>
+          <w:iCs w:val="1"/>
           <w:highlight w:val="white"/>
           <w:rtl w:val="0"/>
         </w:rPr>
@@ -4096,6 +4194,13 @@
           <w:highlight w:val="white"/>
           <w:rtl w:val="0"/>
         </w:rPr>
+        <w:t xml:space="preserve">It took a year and a half of guardianship one to two weekends a month. </w:t>
+      </w:r>
+      <w:r>
+        <w:rPr>
+          <w:highlight w:val="white"/>
+          <w:rtl w:val="0"/>
+        </w:rPr>
         <w:t xml:space="preserve">After all, a side effect of a drug isn’t supposed to occur before a drug is taken. This first dream was like getting a preview of what was to come a month later. </w:t>
       </w:r>
       <w:r>
@@ -4254,10 +4359,27 @@
       <w:r>
         <w:rPr>
           <w:i w:val="1"/>
-          <w:highlight w:val="white"/>
-          <w:rtl w:val="0"/>
-        </w:rPr>
-        <w:t xml:space="preserve">“an intelligence that transcends time and space.</w:t>
+          <w:iCs w:val="1"/>
+          <w:highlight w:val="white"/>
+          <w:rtl w:val="0"/>
+        </w:rPr>
+        <w:t xml:space="preserve">“</w:t>
+      </w:r>
+      <w:r>
+        <w:rPr>
+          <w:highlight w:val="white"/>
+          <w:rtl w:val="0"/>
+        </w:rPr>
+        <w:t xml:space="preserve">an intelligence that transcends time and space</w:t>
+      </w:r>
+      <w:r>
+        <w:rPr>
+          <w:i w:val="1"/>
+          <w:iCs w:val="1"/>
+          <w:highlight w:val="white"/>
+          <w:rtl w:val="0"/>
+        </w:rPr>
+        <w:t xml:space="preserve">.</w:t>
       </w:r>
       <w:r>
         <w:rPr>
@@ -4361,6 +4483,7 @@
       <w:r>
         <w:rPr>
           <w:i w:val="1"/>
+          <w:iCs w:val="1"/>
           <w:highlight w:val="white"/>
           <w:rtl w:val="0"/>
         </w:rPr>
@@ -4426,6 +4549,7 @@
       <w:r>
         <w:rPr>
           <w:i w:val="1"/>
+          <w:iCs w:val="1"/>
           <w:highlight w:val="white"/>
           <w:rtl w:val="0"/>
         </w:rPr>
@@ -4443,40 +4567,40 @@
           <w:highlight w:val="white"/>
           <w:rtl w:val="0"/>
         </w:rPr>
-        <w:t xml:space="preserve">The ground crumbled below us and the trees split into pieces, moving along a disc-shaped path around, above, and below us, reforming in our wake like water flowing around a ship</w:t>
-      </w:r>
-      <w:r>
-        <w:rPr>
-          <w:highlight w:val="white"/>
-          <w:rtl w:val="0"/>
-        </w:rPr>
-        <w:t xml:space="preserve">. We crested the mountain and shot up into the sky. </w:t>
-      </w:r>
-    </w:p>
-    <w:p>
-      <w:pPr>
-        <w:rPr>
-          <w:highlight w:val="white"/>
-        </w:rPr>
-      </w:pPr>
-      <w:r>
-        <w:rPr>
-          <w:rtl w:val="0"/>
-        </w:rPr>
-      </w:r>
-    </w:p>
-    <w:p>
-      <w:pPr>
-        <w:rPr>
-          <w:highlight w:val="white"/>
-        </w:rPr>
-      </w:pPr>
-      <w:r>
-        <w:rPr>
-          <w:highlight w:val="white"/>
-          <w:rtl w:val="0"/>
-        </w:rPr>
-        <w:t xml:space="preserve">Then the entire scene changed. I was viewing a dimly lit room from a distance. I experienced an intense emotion I will never forget. I physically felt things I can never un-feel, and was shown an image that I can never unsee. And like that very first dream, the sensations became so intense that I woke up.</w:t>
+        <w:t xml:space="preserve">The ground crumbled below us and the trees split into pieces, moving along a disc-shaped path around, above, and below us, a vision of space and time splitting and reforming in our wake like water flowing around a ship</w:t>
+      </w:r>
+      <w:r>
+        <w:rPr>
+          <w:highlight w:val="white"/>
+          <w:rtl w:val="0"/>
+        </w:rPr>
+        <w:t xml:space="preserve">. We crested the mountain and shot up into the sky. And then the scene shifted.</w:t>
+      </w:r>
+    </w:p>
+    <w:p>
+      <w:pPr>
+        <w:rPr>
+          <w:highlight w:val="white"/>
+        </w:rPr>
+      </w:pPr>
+      <w:r>
+        <w:rPr>
+          <w:rtl w:val="0"/>
+        </w:rPr>
+      </w:r>
+    </w:p>
+    <w:p>
+      <w:pPr>
+        <w:rPr>
+          <w:highlight w:val="white"/>
+        </w:rPr>
+      </w:pPr>
+      <w:r>
+        <w:rPr>
+          <w:highlight w:val="white"/>
+          <w:rtl w:val="0"/>
+        </w:rPr>
+        <w:t xml:space="preserve">I was viewing a dimly lit room from a distance. I experienced an intense emotion I will never forget. I physically felt things I can never un-feel, and was shown an image that I can never unsee. And like that very first dream, the sensations became so intense that I woke up.</w:t>
       </w:r>
     </w:p>
     <w:p>
@@ -4507,6 +4631,7 @@
       <w:r>
         <w:rPr>
           <w:i w:val="1"/>
+          <w:iCs w:val="1"/>
           <w:highlight w:val="white"/>
           <w:rtl w:val="0"/>
         </w:rPr>
@@ -4517,7 +4642,30 @@
           <w:highlight w:val="white"/>
           <w:rtl w:val="0"/>
         </w:rPr>
-        <w:t xml:space="preserve"> one mean?’ I knew at that point that there must have been some reason as to why this was happening, but I had not yet discovered the dreams of Kyle and Paul. I had never heard of any other examples of this. In these experiences and the conversations that they led to, I pieced together something about my own life that shook me to my core. I learned about a series of events in relation to my life that were ‘true’, that I had no knowledge of or had ever conceived of prior. It had not yet taken on this dimension. Understand that this information is deeply personal, and I will share more details when it is all ready to be shared. </w:t>
+        <w:t xml:space="preserve"> one mean?’ I knew at that point that there must have been some reason as to why this was happening, but I had not yet discovered the dreams of Kyle and Paul. I had never heard of any other examples of this. In these experiences and the conversations that they led to, I pieced together something about my own life that shook me to my core. I learned about a series of events in relation to my life that I had no knowledge of or had ever conceived of prior, were </w:t>
+      </w:r>
+      <w:r>
+        <w:rPr>
+          <w:i w:val="1"/>
+          <w:iCs w:val="1"/>
+          <w:highlight w:val="white"/>
+          <w:rtl w:val="0"/>
+        </w:rPr>
+        <w:t xml:space="preserve">true</w:t>
+      </w:r>
+      <w:r>
+        <w:rPr>
+          <w:highlight w:val="white"/>
+          <w:rtl w:val="0"/>
+        </w:rPr>
+        <w:t xml:space="preserve">.</w:t>
+      </w:r>
+      <w:r>
+        <w:rPr>
+          <w:highlight w:val="white"/>
+          <w:rtl w:val="0"/>
+        </w:rPr>
+        <w:t xml:space="preserve"> It had not yet taken on this dimension. Understand that this information is deeply personal, and really fucked up, and I will share more details when it is all ready to be shared. </w:t>
       </w:r>
     </w:p>
     <w:p>
@@ -4640,6 +4788,7 @@
       <w:r>
         <w:rPr>
           <w:i w:val="1"/>
+          <w:iCs w:val="1"/>
           <w:highlight w:val="white"/>
           <w:rtl w:val="0"/>
         </w:rPr>
@@ -4657,6 +4806,7 @@
       <w:pPr>
         <w:rPr>
           <w:i w:val="1"/>
+          <w:iCs w:val="1"/>
           <w:highlight w:val="white"/>
         </w:rPr>
       </w:pPr>
@@ -4780,7 +4930,6 @@
     <w:p>
       <w:pPr>
         <w:rPr>
-          <w:i w:val="1"/>
           <w:highlight w:val="white"/>
         </w:rPr>
       </w:pPr>
@@ -4791,10 +4940,31 @@
         </w:rPr>
         <w:t xml:space="preserve">The imagery of the disk, the sphere, the golden wheel, the mandala, is something that transcends time periods and cultural backgrounds. Maybe it is an image that something deep down inside of us comprehends in a strange way. If anything, what this really indicates is that I am far from the first person to experience a UFO or disk-like object in a dream. </w:t>
       </w:r>
-      <w:r>
-        <w:rPr>
-          <w:rtl w:val="0"/>
-        </w:rPr>
+    </w:p>
+    <w:p>
+      <w:pPr>
+        <w:rPr>
+          <w:highlight w:val="white"/>
+        </w:rPr>
+      </w:pPr>
+      <w:r>
+        <w:rPr>
+          <w:rtl w:val="0"/>
+        </w:rPr>
+      </w:r>
+    </w:p>
+    <w:p>
+      <w:pPr>
+        <w:rPr>
+          <w:highlight w:val="white"/>
+        </w:rPr>
+      </w:pPr>
+      <w:r>
+        <w:rPr>
+          <w:highlight w:val="white"/>
+          <w:rtl w:val="0"/>
+        </w:rPr>
+        <w:t xml:space="preserve">So an appropriate question to ask in this particular time period would be </w:t>
       </w:r>
     </w:p>
     <w:p>
@@ -4858,6 +5028,7 @@
       <w:r>
         <w:rPr>
           <w:i w:val="1"/>
+          <w:iCs w:val="1"/>
           <w:highlight w:val="white"/>
           <w:rtl w:val="0"/>
         </w:rPr>
@@ -4899,6 +5070,7 @@
       <w:r>
         <w:rPr>
           <w:i w:val="1"/>
+          <w:iCs w:val="1"/>
           <w:highlight w:val="white"/>
           <w:rtl w:val="0"/>
         </w:rPr>
@@ -4940,6 +5112,7 @@
       <w:r>
         <w:rPr>
           <w:i w:val="1"/>
+          <w:iCs w:val="1"/>
           <w:highlight w:val="white"/>
           <w:rtl w:val="0"/>
         </w:rPr>
@@ -4955,6 +5128,7 @@
       <w:r>
         <w:rPr>
           <w:i w:val="1"/>
+          <w:iCs w:val="1"/>
           <w:highlight w:val="white"/>
           <w:rtl w:val="0"/>
         </w:rPr>
@@ -5022,6 +5196,7 @@
       <w:r>
         <w:rPr>
           <w:i w:val="1"/>
+          <w:iCs w:val="1"/>
           <w:highlight w:val="white"/>
           <w:rtl w:val="0"/>
         </w:rPr>
@@ -5082,6 +5257,7 @@
       <w:r>
         <w:rPr>
           <w:i w:val="1"/>
+          <w:iCs w:val="1"/>
           <w:highlight w:val="white"/>
           <w:rtl w:val="0"/>
         </w:rPr>
@@ -5192,6 +5368,7 @@
       <w:r>
         <w:rPr>
           <w:i w:val="1"/>
+          <w:iCs w:val="1"/>
           <w:highlight w:val="white"/>
           <w:rtl w:val="0"/>
         </w:rPr>
@@ -5200,6 +5377,7 @@
       <w:r>
         <w:rPr>
           <w:i w:val="1"/>
+          <w:iCs w:val="1"/>
           <w:highlight w:val="white"/>
           <w:rtl w:val="0"/>
         </w:rPr>
@@ -5241,6 +5419,7 @@
       <w:r>
         <w:rPr>
           <w:i w:val="1"/>
+          <w:iCs w:val="1"/>
           <w:highlight w:val="white"/>
           <w:rtl w:val="0"/>
         </w:rPr>
@@ -5256,6 +5435,7 @@
       <w:r>
         <w:rPr>
           <w:i w:val="1"/>
+          <w:iCs w:val="1"/>
           <w:highlight w:val="white"/>
           <w:rtl w:val="0"/>
         </w:rPr>
@@ -5271,6 +5451,7 @@
       <w:r>
         <w:rPr>
           <w:i w:val="1"/>
+          <w:iCs w:val="1"/>
           <w:highlight w:val="white"/>
           <w:rtl w:val="0"/>
         </w:rPr>
@@ -5318,6 +5499,7 @@
       <w:r>
         <w:rPr>
           <w:i w:val="1"/>
+          <w:iCs w:val="1"/>
           <w:highlight w:val="white"/>
           <w:rtl w:val="0"/>
         </w:rPr>
@@ -5580,6 +5762,7 @@
       <w:r>
         <w:rPr>
           <w:i w:val="1"/>
+          <w:iCs w:val="1"/>
           <w:highlight w:val="white"/>
           <w:rtl w:val="0"/>
         </w:rPr>
@@ -5621,6 +5804,7 @@
       <w:r>
         <w:rPr>
           <w:i w:val="1"/>
+          <w:iCs w:val="1"/>
           <w:highlight w:val="white"/>
           <w:rtl w:val="0"/>
         </w:rPr>
@@ -5718,6 +5902,7 @@
       <w:r>
         <w:rPr>
           <w:i w:val="1"/>
+          <w:iCs w:val="1"/>
           <w:highlight w:val="white"/>
           <w:rtl w:val="0"/>
         </w:rPr>
@@ -5776,6 +5961,7 @@
       <w:pPr>
         <w:rPr>
           <w:i w:val="1"/>
+          <w:iCs w:val="1"/>
           <w:highlight w:val="white"/>
         </w:rPr>
       </w:pPr>
@@ -6027,6 +6213,7 @@
       <w:r>
         <w:rPr>
           <w:i w:val="1"/>
+          <w:iCs w:val="1"/>
           <w:highlight w:val="white"/>
           <w:rtl w:val="0"/>
         </w:rPr>
@@ -6042,6 +6229,7 @@
       <w:r>
         <w:rPr>
           <w:i w:val="1"/>
+          <w:iCs w:val="1"/>
           <w:highlight w:val="white"/>
           <w:rtl w:val="0"/>
         </w:rPr>
@@ -6104,12 +6292,14 @@
       <w:pPr>
         <w:rPr>
           <w:i w:val="1"/>
-          <w:highlight w:val="white"/>
-        </w:rPr>
-      </w:pPr>
-      <w:r>
-        <w:rPr>
-          <w:i w:val="1"/>
+          <w:iCs w:val="1"/>
+          <w:highlight w:val="white"/>
+        </w:rPr>
+      </w:pPr>
+      <w:r>
+        <w:rPr>
+          <w:i w:val="1"/>
+          <w:iCs w:val="1"/>
           <w:highlight w:val="white"/>
           <w:rtl w:val="0"/>
         </w:rPr>
@@ -6121,25 +6311,28 @@
       <w:pPr>
         <w:rPr>
           <w:i w:val="1"/>
-          <w:highlight w:val="white"/>
-        </w:rPr>
-      </w:pPr>
-      <w:r>
-        <w:rPr>
-          <w:rtl w:val="0"/>
-        </w:rPr>
-      </w:r>
-    </w:p>
-    <w:p>
-      <w:pPr>
-        <w:rPr>
-          <w:i w:val="1"/>
-          <w:highlight w:val="white"/>
-        </w:rPr>
-      </w:pPr>
-      <w:r>
-        <w:rPr>
-          <w:i w:val="1"/>
+          <w:iCs w:val="1"/>
+          <w:highlight w:val="white"/>
+        </w:rPr>
+      </w:pPr>
+      <w:r>
+        <w:rPr>
+          <w:rtl w:val="0"/>
+        </w:rPr>
+      </w:r>
+    </w:p>
+    <w:p>
+      <w:pPr>
+        <w:rPr>
+          <w:i w:val="1"/>
+          <w:iCs w:val="1"/>
+          <w:highlight w:val="white"/>
+        </w:rPr>
+      </w:pPr>
+      <w:r>
+        <w:rPr>
+          <w:i w:val="1"/>
+          <w:iCs w:val="1"/>
           <w:highlight w:val="white"/>
           <w:rtl w:val="0"/>
         </w:rPr>
@@ -6628,6 +6821,7 @@
       <w:r>
         <w:rPr>
           <w:i w:val="1"/>
+          <w:iCs w:val="1"/>
           <w:highlight w:val="white"/>
           <w:rtl w:val="0"/>
         </w:rPr>
@@ -6688,6 +6882,7 @@
       <w:r>
         <w:rPr>
           <w:i w:val="1"/>
+          <w:iCs w:val="1"/>
           <w:highlight w:val="white"/>
           <w:rtl w:val="0"/>
         </w:rPr>
@@ -6703,6 +6898,7 @@
       <w:r>
         <w:rPr>
           <w:i w:val="1"/>
+          <w:iCs w:val="1"/>
           <w:highlight w:val="white"/>
           <w:rtl w:val="0"/>
         </w:rPr>
@@ -6718,6 +6914,7 @@
       <w:r>
         <w:rPr>
           <w:i w:val="1"/>
+          <w:iCs w:val="1"/>
           <w:highlight w:val="white"/>
           <w:rtl w:val="0"/>
         </w:rPr>
@@ -6832,6 +7029,7 @@
       <w:r>
         <w:rPr>
           <w:i w:val="1"/>
+          <w:iCs w:val="1"/>
           <w:highlight w:val="white"/>
           <w:rtl w:val="0"/>
         </w:rPr>
@@ -7062,11 +7260,12 @@
           <w:highlight w:val="white"/>
           <w:rtl w:val="0"/>
         </w:rPr>
-        <w:t xml:space="preserve">Another term that indigenous peoples of the upper Amazon use to describe Ayahuasca is ‘plant teacher’</w:t>
-      </w:r>
-      <w:r>
-        <w:rPr>
-          <w:i w:val="1"/>
+        <w:t xml:space="preserve">A term that indigenous peoples of the upper Amazon use to describe Ayahuasca is ‘plant teacher’</w:t>
+      </w:r>
+      <w:r>
+        <w:rPr>
+          <w:i w:val="1"/>
+          <w:iCs w:val="1"/>
           <w:highlight w:val="white"/>
           <w:rtl w:val="0"/>
         </w:rPr>
@@ -7077,7 +7276,7 @@
           <w:highlight w:val="white"/>
           <w:rtl w:val="0"/>
         </w:rPr>
-        <w:t xml:space="preserve">She is just one of many. </w:t>
+        <w:t xml:space="preserve">Just one of many. </w:t>
       </w:r>
       <w:r>
         <w:rPr>
@@ -7117,40 +7316,14 @@
           <w:highlight w:val="white"/>
           <w:rtl w:val="0"/>
         </w:rPr>
-        <w:t xml:space="preserve">Although these ideas may initially seem strange, they only really reinforce themselves</w:t>
-      </w:r>
-      <w:r>
-        <w:rPr>
-          <w:highlight w:val="white"/>
-          <w:rtl w:val="0"/>
-        </w:rPr>
-        <w:t xml:space="preserve">. These experiences point to something larger than just the effects of drugs. </w:t>
-      </w:r>
-      <w:r>
-        <w:rPr>
-          <w:highlight w:val="white"/>
-          <w:rtl w:val="0"/>
-        </w:rPr>
-        <w:t xml:space="preserve">Some voices within the community struggle to conceptualize these experiences and their meanings, particularly those individuals who fail to distinguish between communion with this 'other' intelligence and psychosis</w:t>
-      </w:r>
-      <w:r>
-        <w:rPr>
-          <w:highlight w:val="white"/>
-          <w:rtl w:val="0"/>
-        </w:rPr>
-        <w:t xml:space="preserve">. Some individuals do not recognize the value in these primary religious experiences.</w:t>
-      </w:r>
-    </w:p>
-    <w:p>
-      <w:pPr>
-        <w:rPr>
-          <w:highlight w:val="white"/>
-        </w:rPr>
-      </w:pPr>
-      <w:r>
-        <w:rPr>
-          <w:rtl w:val="0"/>
-        </w:rPr>
+        <w:t xml:space="preserve">Although these ideas may initially appear strange, they tend to become more compelling the more closely they are examined. These experiences repeatedly suggest something beyond the mere pharmacological effects of a drug. Yet some voices within the community struggle to make sense of their implications, particularly those who fail to distinguish between encounters with an “other” intelligence and psychosis. In doing so, they dismiss what may be among the most profound forms of primary religious experience.</w:t>
+      </w:r>
+      <w:r>
+        <w:rPr>
+          <w:highlight w:val="white"/>
+          <w:rtl w:val="0"/>
+        </w:rPr>
+        <w:br w:type="textWrapping"/>
       </w:r>
     </w:p>
     <w:p>
@@ -7185,7 +7358,7 @@
           <w:highlight w:val="white"/>
           <w:rtl w:val="0"/>
         </w:rPr>
-        <w:t xml:space="preserve">. Considering all this, we can reconsider the question skeptics often ask ”Is it real or is it imagined?” Perhaps the answer is ‘both’. </w:t>
+        <w:t xml:space="preserve">. Considering all of this, we can reconsider the question skeptics often ask ”Is it real or is it imagined?” Perhaps the answer is ‘both’. </w:t>
       </w:r>
     </w:p>
     <w:p>
@@ -7268,7 +7441,7 @@
           <w:highlight w:val="white"/>
           <w:rtl w:val="0"/>
         </w:rPr>
-        <w:t xml:space="preserve">Aya Dreams</w:t>
+        <w:t xml:space="preserve">Aya Dreams.</w:t>
       </w:r>
     </w:p>
     <w:p>
@@ -7368,6 +7541,7 @@
     </w:pPr>
     <w:rPr>
       <w:b w:val="0"/>
+      <w:bCs w:val="0"/>
       <w:sz w:val="32"/>
       <w:szCs w:val="32"/>
     </w:rPr>
@@ -7384,6 +7558,7 @@
     </w:pPr>
     <w:rPr>
       <w:b w:val="0"/>
+      <w:bCs w:val="0"/>
       <w:color w:val="434343"/>
       <w:sz w:val="28"/>
       <w:szCs w:val="28"/>
@@ -7433,6 +7608,7 @@
     </w:pPr>
     <w:rPr>
       <w:i w:val="1"/>
+      <w:iCs w:val="1"/>
       <w:color w:val="666666"/>
       <w:sz w:val="22"/>
       <w:szCs w:val="22"/>
@@ -7466,6 +7642,7 @@
     <w:rPr>
       <w:rFonts w:ascii="Arial" w:cs="Arial" w:eastAsia="Arial" w:hAnsi="Arial"/>
       <w:i w:val="0"/>
+      <w:iCs w:val="0"/>
       <w:color w:val="666666"/>
       <w:sz w:val="30"/>
       <w:szCs w:val="30"/>

</xml_diff>